<commit_message>
feat(paper): 6.13 题目构建与重叠度分析 + 6.14 错误分析 + 6.9 Holm 校正
- overlap_analysis.py：4-gram 覆盖中位 0.000、LCS 中位 2 词，对照照抄句为 1.000
- significance_holm.py：Hybrid 显著胜 BM25（p<1e-4），与 Dense 持平（p=0.73/0.09）
- 6.14：9/143 漏检全为排序失败（答案都在文档里）；多跳错误全为选错实体、无空输出
- Word 导出（6 图？不，5 图 9 表）
</commit_message>
<xml_diff>
--- a/docs/paper-draft.docx
+++ b/docs/paper-draft.docx
@@ -4885,6 +4885,17 @@
     </w:p>
     <w:p>
       <w:r>
+        <w:rPr>
+          <w:b/>
+        </w:rPr>
+        <w:t>真实文档上的显著性</w:t>
+      </w:r>
+      <w:r>
+        <w:t>：300 token 预算下，143 题的配对比较是混合结果，本文如实报告。混合检索显著优于 BM25（18 胜 0 负，McNemar p &lt; 0.0001，三组比较经 Holm 校正后仍显著），但与稠密 bge-m3 持平 （5 胜 3 负，p = 0.73），对稠密 bge-large 也未达显著（10 胜 3 负，p = 0.09，Holm 校正后 0.18）。 因此在本语料上系统是「与强稠密检索持平」，而不是超过它；这一设定下的贡献在成本侧，不在准确率侧。</w:t>
+      </w:r>
+    </w:p>
+    <w:p>
+      <w:r>
         <w:t>三条更新后的结论：</w:t>
       </w:r>
     </w:p>
@@ -6126,6 +6137,92 @@
           <w:b/>
         </w:rPr>
         <w:t>检索时间相对上下文太便宜，几乎总该花。</w:t>
+      </w:r>
+    </w:p>
+    <w:p>
+      <w:pPr>
+        <w:pStyle w:val="Heading2"/>
+      </w:pPr>
+      <w:r>
+        <w:t>6.13 题目是怎么写的，和原文有多少重叠</w:t>
+      </w:r>
+    </w:p>
+    <w:p>
+      <w:r>
+        <w:t>143 道题有两个来源：6 道由作者用中文撰写并译为英文，其余由作者依据文档起草、再逐条对照原文核对， 并要求答案在原文中逐字出现。由于「复用原文措辞的题目」会让检索靠字面匹配取胜，本文量化了重叠程度。</w:t>
+      </w:r>
+    </w:p>
+    <w:p>
+      <w:r>
+        <w:t xml:space="preserve">对每道题，计算其 4-gram 出现在源文档中的比例，以及与源文档共享的最长连续词串。4-gram 覆盖率中位数 为 </w:t>
+      </w:r>
+      <w:r>
+        <w:rPr>
+          <w:b/>
+        </w:rPr>
+        <w:t>0.000</w:t>
+      </w:r>
+      <w:r>
+        <w:t xml:space="preserve">（均值 0.042）；143 题中仅 2 题（1.4%）超过 0.50；最长共享词串中位 2 词、最多 7 词。 作为对照，直接把承载答案的原句当作查询，覆盖率中位数为 </w:t>
+      </w:r>
+      <w:r>
+        <w:rPr>
+          <w:b/>
+        </w:rPr>
+        <w:t>1.000</w:t>
+      </w:r>
+      <w:r>
+        <w:t>。可见题目并非对原文的词汇改写： 检索无法靠匹配问题自身的措辞取胜，而这正是评测所需要的性质。</w:t>
+      </w:r>
+    </w:p>
+    <w:p>
+      <w:pPr>
+        <w:pStyle w:val="Heading2"/>
+      </w:pPr>
+      <w:r>
+        <w:t>6.14 错误从哪里来</w:t>
+      </w:r>
+    </w:p>
+    <w:p>
+      <w:r>
+        <w:t>300 token 预算下，混合检索在 143 题中漏掉 9 题。这 9 题里答案片段</w:t>
+      </w:r>
+      <w:r>
+        <w:rPr>
+          <w:b/>
+        </w:rPr>
+        <w:t>都存在于</w:t>
+      </w:r>
+      <w:r>
+        <w:t>目标文档中， 所以失败发生在排序而不是数据：正确段落就在语料里，但没进预算。漏掉的题集中在「短、低信号」的答案上—— 一个裸数字（0.1、X+8）、一个哈希函数个数、一个完成标记 (0, NULL)——语料里很多段落都含这些串， 检索器缺乏区分度。</w:t>
+      </w:r>
+    </w:p>
+    <w:p>
+      <w:r>
+        <w:t>多跳生成基准上的失败模式不同：300 道题里</w:t>
+      </w:r>
+      <w:r>
+        <w:rPr>
+          <w:b/>
+        </w:rPr>
+        <w:t>没有一条空输出</w:t>
+      </w:r>
+      <w:r>
+        <w:t>，错误都是</w:t>
+      </w:r>
+      <w:r>
+        <w:rPr>
+          <w:b/>
+        </w:rPr>
+        <w:t>选错实体</w:t>
+      </w:r>
+      <w:r>
+        <w:t>而非拒答。 例如「Miller v. California 与 Gates v. Collier 哪个先上法庭」答成了后者； 「Francis I Rakoczi 的妻子出生在哪」答成了她的常居地。检索命中答案片段的比例是 0.51–0.69， 而正确率是 0.14–0.52，因此剩余差距里约一半丢在生成侧，不在检索。</w:t>
+      </w:r>
+    </w:p>
+    <w:p>
+      <w:r>
+        <w:t>实际含义是：这两类错误都不会被「更多上下文」或「更大预算」修好——前者需要更好的短答案排序， 后者需要更好的实体消歧与两跳证据拼接。</w:t>
       </w:r>
     </w:p>
     <w:p>

</xml_diff>

<commit_message>
polish: 摘要 380->256 词；修 200/500 与 threefold/fourfold 不一致；§2 合并润色稿；补 Metrics 定义
</commit_message>
<xml_diff>
--- a/docs/paper-draft.docx
+++ b/docs/paper-draft.docx
@@ -35,7 +35,7 @@
     </w:p>
     <w:p>
       <w:r>
-        <w:t>本文把上述框架实现为一个可运行系统。在 200 条检索评测上，系统以 126 token 的平均上下文取得 0.960 召回，高于纠正式基线（0.925，179 token）与稠密检索（0.910，115 token）；差异在配对 bootstrap 与 McNemar 检验下显著，且经重复子采样仍成立。在 500 条端到端评测上，系统以约一半的 prompt 成本达到固定 top-3 的同等质量（0.912 vs 0.920）。两个 LongBench 检索子集上召回为 0.995 与 1.000；在三个多跳生成基准上，检索提升本地 4B 模型的正确率，在 HotpotQA 上同样提升托管大模型。200 条双人标注显示自动指标偏保守，故报告值为召回下界。上述结果表明，预算感知的检索深度选择是「更低成本、更高准确率」的一条可行路径。本文进一步给出「质量目标 → 预算」的保形校准协议：20 条标注题即可让新问题以至少 1−α 的概率被覆盖，混合检索器上经验覆盖与名义值差距不超过 0.015、预算仅 120–276 token；对不可达目标显式拒绝。</w:t>
+        <w:t>本文把上述框架实现为一个可运行系统。在 500 题的受控合成评测上，系统以 126 token 的平均上下文取得 0.960 召回，高于纠正式基线（0.925，179 token）与稠密检索（0.910，115 token）；差异在配对 bootstrap 与 McNemar 检验下显著，且经重复子采样仍成立。在 312 篇官方文档上，混合检索以 300 token 预算取得 0.910 召回，按难度自适应的规则以少 11%–20% 的 token 达到同等召回（bootstrap 95% CI [11.2%, 19.8%]）；在四个 BEIR 子集上，同一规则在同等 nDCG@10 下节省 1%–24% 上下文，并在一个人为构造的对抗子集上失效——这一点如实报告。最后，split conformal 一层把「召回目标」翻译成带覆盖保证的预算：20 条标注题即可让新问题以至少 1−α 的概率被覆盖，混合检索器上经验覆盖与名义值差距不超过 0.015、预算仅 120–276 token；对检索器达不到的目标显式拒绝，而不是许诺。</w:t>
       </w:r>
     </w:p>
     <w:p>
@@ -9575,7 +9575,7 @@
         <w:t>Data Availability Statement.</w:t>
       </w:r>
       <w:r>
-        <w:t xml:space="preserve"> 全部代码、评测集与实验脚本位于 https://github.com/mylgtab/budget-rag （MIT 许可，v1.0.0）。 LongBench 各子集的少量快照随仓库提供，完整数据可由 scripts/fetch_longbench.py 从原发布源获取。 所有论文表格可由 make check、scripts/baselines.py、scripts/seed_stability.py 与 scripts/latency_bench.py 复现。</w:t>
+        <w:t xml:space="preserve"> 全部代码、评测集与实验脚本位于 https://github.com/mylgtab/budget-rag （MIT 许可，v1.1.0）。 LongBench 各子集的少量快照随仓库提供，完整数据可由 scripts/fetch_longbench.py 从原发布源获取。 所有论文表格可由 make check、scripts/baselines.py、scripts/seed_stability.py 与 scripts/latency_bench.py 复现。</w:t>
       </w:r>
     </w:p>
     <w:p>

</xml_diff>

<commit_message>
submission: 双盲匿名稿 + 标题页 + 投稿包（图/cover letter/checklist）；中文稿同步 A-C 与 D 标签、289、0.730/0.702 等
</commit_message>
<xml_diff>
--- a/docs/paper-draft.docx
+++ b/docs/paper-draft.docx
@@ -5286,7 +5286,7 @@
         <w:t>按 token 截断本身没有优势</w:t>
       </w:r>
       <w:r>
-        <w:t>：在内部评测里，固定 k=8 用 294 token 达到与预算 300</w:t>
+        <w:t>：在内部评测里，固定 k=8 用 289 token 达到与预算 300</w:t>
       </w:r>
     </w:p>
     <w:p>
@@ -6425,7 +6425,7 @@
     </w:p>
     <w:p>
       <w:r>
-        <w:t>真实系统同时受 token、延迟与钱约束，因此会有人问：只用标量预算是不是把问题简化了？ 本文在 301 题上实测检索侧：BM25 16 ms、向量检索 45 ms（含查询编码）、混合检索 73 ms， 而生成 p50 为 898 ms（6.8 节）。检索最多占端到端 7.5%，且三个成本维度在本设定下共线： 钱是 token 的固定倍数，prefill 延迟与上下文长度近似线性，不同检索器之间 16–70 ms 的差异 不足以撼动延迟预算。 把 6.16 的官方分类器也算进来，各策略的运行点如下：</w:t>
+        <w:t>真实系统同时受 token、延迟与钱约束，因此会有人问：只用标量预算是不是把问题简化了？ 本文在 301 题上实测检索侧：BM25 16 ms、向量检索 45 ms（含查询编码）、混合检索 73 ms， 而生成 p50 为 898 ms（6.8 节）。检索最多占端到端 7.5%，且三个成本维度在本设定下共线： 钱是 token 的固定倍数，prefill 延迟与上下文长度近似线性，不同检索器之间 16–74 ms 的差异 不足以撼动延迟预算。 把 6.16 的官方分类器也算进来，各策略的运行点如下：</w:t>
       </w:r>
     </w:p>
     <w:p>
@@ -6921,7 +6921,7 @@
               <w:rPr>
                 <w:sz w:val="18"/>
               </w:rPr>
-              <w:t>混合检索 top-8</w:t>
+              <w:t>混合检索（预算 300）</w:t>
             </w:r>
           </w:p>
         </w:tc>
@@ -7644,7 +7644,7 @@
               <w:rPr>
                 <w:sz w:val="18"/>
               </w:rPr>
-              <w:t>混合检索 top-8</w:t>
+              <w:t>固定 k=8（混合）</w:t>
             </w:r>
           </w:p>
         </w:tc>
@@ -7721,7 +7721,7 @@
         <w:t>表 12</w:t>
       </w:r>
       <w:r>
-        <w:t>：逐题阈值扫描：nDCG@10、token 与相对固定 k=8 的节省。</w:t>
+        <w:t>：逐题阈值扫描（内部基准）：召回、token 与相对固定 k=8 的节省。</w:t>
       </w:r>
     </w:p>
     <w:tbl>
@@ -8841,7 +8841,7 @@
     </w:p>
     <w:p>
       <w:r>
-        <w:t>但最强的可迁移结论比原框架窄。在 312 篇文档与 BEIR scifact 上，按 token 截断相对一个选得好的固定 k 并无收益（同召回 318 对 294 token）；真正迁移的是按检索分数间隔逐题决定取几块——同命中率下，自然语料 省 1%–24%，对抗语料上则无收益（6.9 节）。机制是「这道题需要几块」，而不是「停在某个 token 数」。</w:t>
+        <w:t>但最强的可迁移结论比原框架窄。在 312 篇文档与 BEIR scifact 上，按 token 截断相对一个选得好的固定 k 并无收益（同召回 318 对 289 token）；真正迁移的是按检索分数间隔逐题决定取几块——同命中率下，自然语料 省 1%–24%，对抗语料上则无收益（6.9 节）。机制是「这道题需要几块」，而不是「停在某个 token 数」。</w:t>
       </w:r>
     </w:p>
     <w:p>
@@ -9055,7 +9055,12 @@
     </w:p>
     <w:p>
       <w:r>
-        <w:t>负结果集中放在这里。伪相关反馈（PRF）造成查询漂移，句级与固定块上分别掉 1.6 pt 与 19.6 pt； 第 0 级「不检索直接答」在技术语料上不可行，contain 只有 0.11；贪心在预算 200 时比暴力最优低 6 pt，方向与命题 1 的近似性预测一致；学习型路由器（TF-IDF 0.747 / BERT 0.702）不如分数门控 （0.960）。它们的作用是排除替代解释，故置于附录。</w:t>
+        <w:t>负结果集中放在这里，用来界定主结论的下界。伪相关反馈（PRF）在句级与固定块上分别掉 1.6 pt 与 19.6 pt；查询漂移是一种可能解释，但实验未将其隔离。第 0 级「不检索直接答」在技术语料上不可行， contain 只有 0.11。预算 200 时贪心比暴力最优低 6 pt：方向与收益递减一致，但命题 1 的界并不预测 单个差距的大小。</w:t>
+      </w:r>
+    </w:p>
+    <w:p>
+      <w:r>
+        <w:t>学习型路由器是最有信息量的负结果，因为它常被当作「更讲原理」的替代方案。500 题基准上，TF-IDF 与 BERT 分类器的分类准确率为 0.730 与 0.702。准确率与门控的检索召回不可直接比较，因此我们又把它们 当作路由策略在同一批题上运行：召回 0.744 与 0.712，平均约 25–30 token；同一批题上分数门控为 0.948 召回、175 token。路由器便宜一个数量级、召回也明显更低，两种运行点同时变了信号来源与预算， 本对比不能把差异单独归因于信号来源。</w:t>
       </w:r>
     </w:p>
     <w:p>
@@ -9079,7 +9084,7 @@
     </w:p>
     <w:p>
       <w:r>
-        <w:t>make test          # 65 个测试</w:t>
+        <w:t>make test          # 75 个测试</w:t>
       </w:r>
     </w:p>
     <w:p>
@@ -9138,13 +9143,7 @@
         <w:t>本文复现到的一层。</w:t>
       </w:r>
       <w:r>
-        <w:t xml:space="preserve"> 官方分类器的核心是「用三种策略的实跑结果自动生成复杂度标签」。 本文按同一构造方式在自有评测集上生成标签——把「能召回答案的最小动作」记为复杂度档 （1 块 / 混合 5 块 / 需改写），得到 222 / 52 / 17 / 9 的分布（第 6.6 节前的 4.30 实验）， 并训练了 TF-IDF 与 BERT 两个分类器（准确率 0.747 / 0.702）。 即：</w:t>
-      </w:r>
-      <w:r>
-        <w:rPr>
-          <w:b/>
-        </w:rPr>
-        <w:t>标签构造与判别任务与原版一致，模型规模与环境不同。</w:t>
+        <w:t xml:space="preserve"> 官方分类器的核心是「用三种策略的实跑结果自动生成复杂度标签」。 本文按同一原则在自有评测集上生成标签：把「能召回答案的最小动作」记为复杂度档（1 块 / 混合 5 块 / 需改写），无任何动作能召回的题记为第四类。500 题基准上的分布为 353 / 101 / 25 / 21，并训练 TF-IDF 与 BERT 两个分类器，四分类准确率为 0.730 / 0.702。构造原则相同，但标签定义与判别任务并不与原版 完全相同，本文不宣称二者等价。</w:t>
       </w:r>
     </w:p>
     <w:p>
@@ -9183,19 +9182,10 @@
         <w:rPr>
           <w:b/>
         </w:rPr>
-        <w:t>这一层复现得到的结论是有意义的</w:t>
-      </w:r>
-      <w:r>
-        <w:t>：在标签构造与原版一致的前提下，基于问题文本的分类器 （0.747 / 0.702）仍达不到基于检索分数的门控（0.960）——说明差距来自</w:t>
-      </w:r>
-      <w:r>
-        <w:rPr>
-          <w:b/>
-        </w:rPr>
-        <w:t>信号来源</w:t>
-      </w:r>
-      <w:r>
-        <w:t>， 而不是模型规模或实现细节。若换成原版 T5-large，预期只会提高分类器本身的准确率， 不改变这一判断。</w:t>
+        <w:t>这一层复现能说明什么、不能说明什么</w:t>
+      </w:r>
+      <w:r>
+        <w:t>：路由器分类准确率为 0.730 / 0.702，作为路由策略的召回为 0.744 / 0.712（约 25–30 token）；同一批题上分数门控为 0.948 召回、175 token。路由器便宜一个数量级 而召回明显更低，比较同时变了信号来源与运行点，不能据此单独断言差距来自信号来源；换成原版 T5-large 会改变分类器准确率，其对结论的影响尚未测试。</w:t>
       </w:r>
     </w:p>
     <w:p>
@@ -9705,17 +9695,17 @@
     </w:p>
     <w:p>
       <w:r>
-        <w:t>*假设*：(A1) 分数排序即效用排序；(A3) 存在单调递增 g 使 p_1 = g(γ)； (H1) p_1 ≥ 1/2；(H2) ρ 关于 p_1 单调不增。</w:t>
+        <w:t>*假设*：（M1）分数排序即效用排序；（M2）条件命中概率随名次递减，p_1 ≥ p_2 ≥ … ≥ p_K；（M3）存在单调递增 g 使 p_1 = g(γ)；（H1）p_1 ≥ 1/2；（H2）ρ 关于 p_1 单调不增。</w:t>
       </w:r>
     </w:p>
     <w:p>
       <w:r>
-        <w:t>*定理*：在 A1、A3、H1、H2 下，Δ_1 关于 γ 单调不增。</w:t>
+        <w:t>*定理*：在 M1、M3、H1、H2 下，Δ_1 关于 γ 单调不增（M2 在 k=1 时不需要，用于引理 D.2）。</w:t>
       </w:r>
     </w:p>
     <w:p>
       <w:r>
-        <w:t>*证明*：取两道题 q、q'，使 p_1(q) ≤ p_1(q') 且两者 ≥ 1/2。由 H2 得 ρ(q') ≤ ρ(q)。 令 h(p) = p(1−p)，则 Δ_1(q') − Δ_1(q) = ρ(q')h(p_1(q')) − ρ(q)h(p_1(q)) ≤ ρ(q)[h(p_1(q')) − h(p_1(q))]， 因为 ρ(q') ≤ ρ(q) 且 ρ ≥ 0。又 h'(p) = 1−2p ≤ 0 在 [1/2,1] 上成立， 故 h(p_1(q')) ≤ h(p_1(q))，差 ≤ 0。再由 A3（γ 大 ⇒ p_1 大）得 Δ_1 关于 γ 不增。∎</w:t>
+        <w:t>*证明*：取两道题 q、q'，使 p_1(q) ≤ p_1(q') 且两者 ≥ 1/2。由 H2 得 ρ(q') ≤ ρ(q)。 令 h(p) = p(1−p)，则 Δ_1(q') − Δ_1(q) = ρ(q')h(p_1(q')) − ρ(q)h(p_1(q)) ≤ ρ(q)[h(p_1(q')) − h(p_1(q))]， 因为 ρ(q') ≤ ρ(q) 且 ρ ≥ 0。又 h'(p) = 1−2p ≤ 0 在 [1/2,1] 上成立， 故 h(p_1(q')) ≤ h(p_1(q))，差 ≤ 0。再由 M3（γ 大 ⇒ p_1 大）得 Δ_1 关于 γ 不增。∎</w:t>
       </w:r>
     </w:p>
     <w:p>
@@ -9723,10 +9713,10 @@
         <w:rPr>
           <w:b/>
         </w:rPr>
-        <w:t>D.3 反例 1：A1 + A3 不够。</w:t>
-      </w:r>
-      <w:r>
-        <w:t xml:space="preserve"> 取 p_i ≡ θ（常数），则 ρ = 1、Δ_1 = θ(1−θ)， 故 dΔ_1/dθ = 1−2θ。当 θ &lt; 1/2 时，把握度越高边际收益反而越大，与定理相反。 这就是 H1（高把握区）不可省的原因。注意此例不满足 A2，因此它只说明 A1+A3 不足。</w:t>
+        <w:t>D.3 反例 1：M1 + M3 不够。</w:t>
+      </w:r>
+      <w:r>
+        <w:t xml:space="preserve"> 取 p_i ≡ θ（常数），则 ρ = 1、Δ_1 = θ(1−θ)， 故 dΔ_1/dθ = 1−2θ。当 θ &lt; 1/2 时，把握度越高边际收益反而越大，与定理相反。 这就是 H1（高把握区）不可省的原因。注意此例不满足 A2，因此它只说明 M1+M3 不足。</w:t>
       </w:r>
     </w:p>
     <w:p>
@@ -9737,7 +9727,7 @@
         <w:t>D.4 反例 2：H2 是本质条件。</w:t>
       </w:r>
       <w:r>
-        <w:t xml:space="preserve"> 取 p_1 = θ、p_2 = θ²，其余 p_i = 0。此时 A1、A2（θ² ≤ θ）、A3 与 H1（取 θ ∈ [1/2, 2/3)）都成立，但 Δ_1 = (1−θ)θ²、dΔ_1/dθ = θ(2−3θ) &gt; 0（θ &lt; 2/3），结论不成立。 </w:t>
+        <w:t xml:space="preserve"> 取 p_1 = θ、p_2 = θ²，其余 p_i = 0。此时 M1、M2（θ² ≤ θ）、M3 与 H1（取 θ ∈ [1/2, 2/3)）都成立，但 Δ_1 = (1−θ)θ²、dΔ_1/dθ = θ(2−3θ) &gt; 0（θ &lt; 2/3），结论不成立。 </w:t>
       </w:r>
       <w:r>
         <w:rPr>

</xml_diff>